<commit_message>
fix: update AgriRover convention paper PDF structure
Co-authored-by: VIVEK KUMAR GUPTA <271483430+aman123825@users.noreply.github.com>
</commit_message>
<xml_diff>
--- a/paper/AgriRover_IEI_38th_National_Convention_Full_Paper.docx
+++ b/paper/AgriRover_IEI_38th_National_Convention_Full_Paper.docx
@@ -149,7 +149,7 @@
                 <w:color w:val="1A1C1A"/>
                 <w:sz w:val="20"/>
               </w:rPr>
-              <w:t>Indian smallholders apply agrochemicals almost entirely by blanket spraying, because per-plant decision-making is not economically available to a farmer cultivating one to five acres. The consequence is measurable on three axes at once: chemical is wasted on healthy plants, the operator is exposed to the spray cloud for the whole duration of the pass, and no spatial record of the intervention survives the season. This paper presents AgriRover, a differential-drive ground robot designed to close that gap at a hardware cost of Rs 41,150, by combining on-board vision-based weed and disease detection, a needle-injection dosing head that treats individual plants, and a seven-parameter soil probe read over Modbus RTU. The contribution of this paper is not a yield claim; it is an engineering account of how a machine that autonomously carries chemical through a standing crop can be made safe, auditable and affordable using commodity components. We describe a three-tier architecture that deliberately separates hard real-time actuation on an ESP32 running FreeRTOS from soft real-time perception on a Raspberry Pi 5, and we present the safety design in full: a nine-bit FreeRTOS event group whose drive-inhibit mask is defined once in a single header, a latching mechanical emergency stop wired to the microcontroller enable pin so that no software element can override it, a 1500 ms dead-man timeout on the command link, and HMAC-SHA256 authentication with a monotonic replay counter on every motion command. We then report what has actually been verified. A 147-test Python suite passes across ten modules; a closed-loop kinematic simulation of a 20 m by 30 m plot shows that the extended Kalman filter reduces localisation root-mean-square error from 17.893 m under dead reckoning and 2.256 m under raw GNSS to 0.943 m, and reduces root-mean-square cross-track error during row following from 13.817 m to 0.563 m, which is the difference between a machine that leaves the row and one that stays inside a 0.60 m row corridor. We are explicit that the physical rover is not yet built, that no field trial has been run, and that every agronomic figure in the paper is stated as a validation gate rather than a result. We close with the six-gate acceptance protocol — bench, tethered, plot and multi-week field stages — that the project must pass before any efficacy claim is made, and we argue that publishing the protocol before the data is the honest order in which agricultural robotics for smallholders should be reported.</w:t>
+              <w:t>Indian smallholders apply agrochemicals almost entirely by blanket spraying, because per-plant decision-making is not economically available to a farmer cultivating one to five acres. The consequence is measurable on three axes at once: chemical is wasted on healthy plants, the operator is exposed to the spray cloud for the whole duration of the pass, and no spatial record of the intervention survives the season. This paper presents AgriRover, a differential-drive ground robot designed to close that gap at a hardware cost under Rs 50,000 — Rs 41,150 in the sensing-only scout configuration, rising to approximately Rs 47,000 once the dosing head and soil probe are fitted — by combining on-board vision-based weed and disease detection, a needle-injection dosing head that treats individual plants, and a seven-parameter soil probe read over Modbus RTU. The contribution of this paper is not a yield claim; it is an engineering account of how a machine that autonomously carries chemical through a standing crop can be made safe, auditable and affordable using commodity components. We describe a three-tier architecture that deliberately separates hard real-time actuation on an ESP32 running FreeRTOS from soft real-time perception on a Raspberry Pi 5, and we present the safety design in full: a nine-bit FreeRTOS event group whose drive-inhibit mask is defined once in a single header, a latching mechanical emergency stop wired to the microcontroller enable pin so that no software element can override it, a 1500 ms dead-man timeout on the command link, and HMAC-SHA256 authentication with a monotonic replay counter on every motion command. We then report what has actually been verified. A 147-test Python suite passes across ten modules; a closed-loop kinematic simulation of a 20 m by 30 m plot shows that the extended Kalman filter reduces localisation root-mean-square error from 17.893 m under dead reckoning and 2.256 m under raw GNSS to 0.943 m, and reduces root-mean-square cross-track error during row following from 13.817 m to 0.563 m, which is the difference between a machine that leaves the row and one that stays inside a 0.60 m row corridor. We are explicit that the physical rover is not yet built, that no field trial has been run, and that every agronomic figure in the paper is stated as a validation gate rather than a result. We close with the six-gate acceptance protocol — bench, tethered, plot and multi-week field stages — that the project must pass before any efficacy claim is made, and we argue that publishing the protocol before the data is the honest order in which agricultural robotics for smallholders should be reported.</w:t>
             </w:r>
           </w:p>
         </w:tc>
@@ -318,7 +318,7 @@
           <w:color w:val="1A1C1A"/>
           <w:sz w:val="22"/>
         </w:rPr>
-        <w:t>First, cost is a hard design constraint and not an optimisation target. The bill of materials is fixed at Rs 41,150 using components available from Indian retail supply, and every subsystem choice in this paper was made under that ceiling. Where a more capable component exists, we record it as an upgrade path rather than adopting it.</w:t>
+        <w:t>First, cost is a hard design constraint and not an optimisation target. The ceiling is fixed at Rs 50,000 using components available from Indian retail supply: the sensing-only scout configuration is costed at Rs 41,150, and adding the dosing head and seven-parameter soil probe brings the machine described here to approximately Rs 47,000. Every subsystem choice in this paper was made under that ceiling. Where a more capable component exists, we record it as an upgrade path rather than adopting it.</w:t>
       </w:r>
     </w:p>
     <w:p>
@@ -741,7 +741,7 @@
                 <w:color w:val="1A1C1A"/>
                 <w:sz w:val="18"/>
               </w:rPr>
-              <w:t>Hardware cost at or below Rs 45,000</w:t>
+              <w:t>Hardware cost at or below Rs 50,000</w:t>
             </w:r>
           </w:p>
         </w:tc>
@@ -762,7 +762,7 @@
                 <w:color w:val="1A1C1A"/>
                 <w:sz w:val="18"/>
               </w:rPr>
-              <w:t>Fixed BOM of Rs 41,150; commodity ESP32 and Raspberry Pi 5; no proprietary implement</w:t>
+              <w:t>Rs 41,150 scout configuration, approximately Rs 47,000 with dosing head and soil probe; commodity ESP32 and Raspberry Pi 5; no proprietary implement</w:t>
             </w:r>
           </w:p>
         </w:tc>
@@ -5254,7 +5254,41 @@
           <w:color w:val="1A1C1A"/>
           <w:sz w:val="22"/>
         </w:rPr>
-        <w:t>Table 5 gives the planned bill of materials at Rs 41,150. The figure is a planning total against Indian retail pricing at the time of specification, exclusive of fabrication labour and of the spare-parts allowance that a field campaign requires.</w:t>
+        <w:t>The design is costed in two configurations against a hard ceiling of Rs 50,000. The sensing-only scout configuration — the machine that navigates, images and logs, but carries no chemical — is costed at Rs 41,150. Fitting the needle-injection dosing head and the seven-parameter soil probe described in Sections 5 and 6 adds Rs 5,850, bringing the full machine to approximately Rs 47,000 and leaving roughly Rs 3,000 of the ceiling unallocated against price variance. Both figures are planning totals against Indian retail pricing at the time of specification, exclusive of fabrication labour, taxes, shipping and the spare-parts allowance that a field campaign requires.</w:t>
+      </w:r>
+    </w:p>
+    <w:p>
+      <w:pPr>
+        <w:keepNext w:val="0"/>
+        <w:spacing w:before="0" w:after="120" w:line="276" w:lineRule="auto"/>
+        <w:jc w:val="both"/>
+      </w:pPr>
+      <w:r>
+        <w:rPr>
+          <w:rFonts w:ascii="Times New Roman" w:hAnsi="Times New Roman" w:eastAsia="Times New Roman"/>
+          <w:b w:val="0"/>
+          <w:i w:val="0"/>
+          <w:color w:val="1A1C1A"/>
+          <w:sz w:val="22"/>
+        </w:rPr>
+        <w:t>We state the two configurations separately because they are not the same claim. The scout configuration is what the first supervised pilot is expected to field, on the reasoning of Section 10 that no dosing efficacy claim can be made before the perception and localisation gates pass. The dosing configuration is the machine this paper specifies in full. Reporting only the lower number would understate the cost of the design actually described.</w:t>
+      </w:r>
+    </w:p>
+    <w:p>
+      <w:pPr>
+        <w:keepNext w:val="0"/>
+        <w:spacing w:before="0" w:after="120" w:line="276" w:lineRule="auto"/>
+        <w:jc w:val="both"/>
+      </w:pPr>
+      <w:r>
+        <w:rPr>
+          <w:rFonts w:ascii="Times New Roman" w:hAnsi="Times New Roman" w:eastAsia="Times New Roman"/>
+          <w:b w:val="0"/>
+          <w:i w:val="0"/>
+          <w:color w:val="1A1C1A"/>
+          <w:sz w:val="22"/>
+        </w:rPr>
+        <w:t>Table 5 gives the group subtotals. The rows sum to the stated totals so that a reader can audit the arithmetic rather than take a ranking on trust.</w:t>
       </w:r>
     </w:p>
     <w:p>
@@ -5359,7 +5393,7 @@
                 <w:color w:val="FFFFFF"/>
                 <w:sz w:val="18"/>
               </w:rPr>
-              <w:t>Share of total</w:t>
+              <w:t>Planning Rs</w:t>
             </w:r>
           </w:p>
         </w:tc>
@@ -5382,7 +5416,7 @@
                 <w:color w:val="1A1C1A"/>
                 <w:sz w:val="18"/>
               </w:rPr>
-              <w:t>Compute</w:t>
+              <w:t>Compute and inference</w:t>
             </w:r>
           </w:p>
         </w:tc>
@@ -5403,7 +5437,7 @@
                 <w:color w:val="1A1C1A"/>
                 <w:sz w:val="18"/>
               </w:rPr>
-              <w:t>Raspberry Pi 5, ESP32 development board, storage</w:t>
+              <w:t>Raspberry Pi 5 with PSU and active cooler, 13 TOPS inference HAT, ESP32 development board, industrial microSD</w:t>
             </w:r>
           </w:p>
         </w:tc>
@@ -5424,7 +5458,7 @@
                 <w:color w:val="1A1C1A"/>
                 <w:sz w:val="18"/>
               </w:rPr>
-              <w:t>Largest single group</w:t>
+              <w:t>14,950</w:t>
             </w:r>
           </w:p>
         </w:tc>
@@ -5448,7 +5482,7 @@
                 <w:color w:val="1A1C1A"/>
                 <w:sz w:val="18"/>
               </w:rPr>
-              <w:t>Drive</w:t>
+              <w:t>Power</w:t>
             </w:r>
           </w:p>
         </w:tc>
@@ -5470,7 +5504,7 @@
                 <w:color w:val="1A1C1A"/>
                 <w:sz w:val="18"/>
               </w:rPr>
-              <w:t>Two BTS7960 half-bridge modules, geared motors, wheel encoders</w:t>
+              <w:t>Two swappable LiFePO4 packs, charger, BMS, fuses, current monitor</w:t>
             </w:r>
           </w:p>
         </w:tc>
@@ -5492,7 +5526,7 @@
                 <w:color w:val="1A1C1A"/>
                 <w:sz w:val="18"/>
               </w:rPr>
-              <w:t>Second</w:t>
+              <w:t>8,800</w:t>
             </w:r>
           </w:p>
         </w:tc>
@@ -5515,7 +5549,7 @@
                 <w:color w:val="1A1C1A"/>
                 <w:sz w:val="18"/>
               </w:rPr>
-              <w:t>Sensing</w:t>
+              <w:t>Perception and imaging</w:t>
             </w:r>
           </w:p>
         </w:tc>
@@ -5536,7 +5570,7 @@
                 <w:color w:val="1A1C1A"/>
                 <w:sz w:val="18"/>
               </w:rPr>
-              <w:t>GNSS with augmentation, IMU, seven-parameter soil probe, ultrasonic ranging, camera</w:t>
+              <w:t>Forward row camera with wide lens, autofocus evidence camera, macro lens with diffuse ring light, trap-imaging dock with fiducial scale</w:t>
             </w:r>
           </w:p>
         </w:tc>
@@ -5557,7 +5591,7 @@
                 <w:color w:val="1A1C1A"/>
                 <w:sz w:val="18"/>
               </w:rPr>
-              <w:t>Second</w:t>
+              <w:t>7,300</w:t>
             </w:r>
           </w:p>
         </w:tc>
@@ -5581,7 +5615,7 @@
                 <w:color w:val="1A1C1A"/>
                 <w:sz w:val="18"/>
               </w:rPr>
-              <w:t>Dosing</w:t>
+              <w:t>Structure and integration</w:t>
             </w:r>
           </w:p>
         </w:tc>
@@ -5603,7 +5637,7 @@
                 <w:color w:val="1A1C1A"/>
                 <w:sz w:val="18"/>
               </w:rPr>
-              <w:t>Linear actuator with limit switches, peristaltic pump, needle head, tank</w:t>
+              <w:t>Chassis with adjustable camera mast, guards and canopy, IP-rated enclosure with membrane vent and conformal coating, GX12 service harness</w:t>
             </w:r>
           </w:p>
         </w:tc>
@@ -5625,7 +5659,7 @@
                 <w:color w:val="1A1C1A"/>
                 <w:sz w:val="18"/>
               </w:rPr>
-              <w:t>Third</w:t>
+              <w:t>5,800</w:t>
             </w:r>
           </w:p>
         </w:tc>
@@ -5648,7 +5682,7 @@
                 <w:color w:val="1A1C1A"/>
                 <w:sz w:val="18"/>
               </w:rPr>
-              <w:t>Power and safety</w:t>
+              <w:t>Navigation and safety sensing</w:t>
             </w:r>
           </w:p>
         </w:tc>
@@ -5669,7 +5703,7 @@
                 <w:color w:val="1A1C1A"/>
                 <w:sz w:val="18"/>
               </w:rPr>
-              <w:t>3S lithium-polymer pack, regulation, latching E-stop, relays, wiring</w:t>
+              <w:t>Front and rear ToF, six-axis IMU, GNSS receiver, latching E-stop with bumper and ultrasonic backup</w:t>
             </w:r>
           </w:p>
         </w:tc>
@@ -5690,7 +5724,7 @@
                 <w:color w:val="1A1C1A"/>
                 <w:sz w:val="18"/>
               </w:rPr>
-              <w:t>Balance</w:t>
+              <w:t>2,300</w:t>
             </w:r>
           </w:p>
         </w:tc>
@@ -5714,7 +5748,7 @@
                 <w:color w:val="1A1C1A"/>
                 <w:sz w:val="18"/>
               </w:rPr>
-              <w:t>Planned total</w:t>
+              <w:t>Drive and odometry</w:t>
             </w:r>
           </w:p>
         </w:tc>
@@ -5736,6 +5770,7 @@
                 <w:color w:val="1A1C1A"/>
                 <w:sz w:val="18"/>
               </w:rPr>
+              <w:t>Four 12 V geared motors, two BTS7960 half-bridge modules, Hall-effect wheel encoders</w:t>
             </w:r>
           </w:p>
         </w:tc>
@@ -5757,7 +5792,203 @@
                 <w:color w:val="1A1C1A"/>
                 <w:sz w:val="18"/>
               </w:rPr>
-              <w:t>Rs 41,150</w:t>
+              <w:t>2,000</w:t>
+            </w:r>
+          </w:p>
+        </w:tc>
+      </w:tr>
+      <w:tr>
+        <w:tc>
+          <w:tcPr>
+            <w:tcW w:type="dxa" w:w="2823"/>
+          </w:tcPr>
+          <w:p>
+            <w:pPr>
+              <w:spacing w:before="20" w:after="20"/>
+              <w:jc w:val="left"/>
+            </w:pPr>
+            <w:r>
+              <w:rPr>
+                <w:rFonts w:ascii="Times New Roman" w:hAnsi="Times New Roman" w:eastAsia="Times New Roman"/>
+                <w:b w:val="0"/>
+                <w:i w:val="0"/>
+                <w:color w:val="1A1C1A"/>
+                <w:sz w:val="18"/>
+              </w:rPr>
+              <w:t>Scout configuration subtotal</w:t>
+            </w:r>
+          </w:p>
+        </w:tc>
+        <w:tc>
+          <w:tcPr>
+            <w:tcW w:type="dxa" w:w="3953"/>
+          </w:tcPr>
+          <w:p>
+            <w:pPr>
+              <w:spacing w:before="20" w:after="20"/>
+              <w:jc w:val="left"/>
+            </w:pPr>
+            <w:r>
+              <w:rPr>
+                <w:rFonts w:ascii="Times New Roman" w:hAnsi="Times New Roman" w:eastAsia="Times New Roman"/>
+                <w:b w:val="0"/>
+                <w:i w:val="0"/>
+                <w:color w:val="1A1C1A"/>
+                <w:sz w:val="18"/>
+              </w:rPr>
+            </w:r>
+          </w:p>
+        </w:tc>
+        <w:tc>
+          <w:tcPr>
+            <w:tcW w:type="dxa" w:w="2635"/>
+          </w:tcPr>
+          <w:p>
+            <w:pPr>
+              <w:spacing w:before="20" w:after="20"/>
+              <w:jc w:val="left"/>
+            </w:pPr>
+            <w:r>
+              <w:rPr>
+                <w:rFonts w:ascii="Times New Roman" w:hAnsi="Times New Roman" w:eastAsia="Times New Roman"/>
+                <w:b w:val="0"/>
+                <w:i w:val="0"/>
+                <w:color w:val="1A1C1A"/>
+                <w:sz w:val="18"/>
+              </w:rPr>
+              <w:t>41,150</w:t>
+            </w:r>
+          </w:p>
+        </w:tc>
+      </w:tr>
+      <w:tr>
+        <w:tc>
+          <w:tcPr>
+            <w:tcW w:type="dxa" w:w="2823"/>
+            <w:shd w:val="clear" w:fill="EEF2EF"/>
+          </w:tcPr>
+          <w:p>
+            <w:pPr>
+              <w:spacing w:before="20" w:after="20"/>
+              <w:jc w:val="left"/>
+            </w:pPr>
+            <w:r>
+              <w:rPr>
+                <w:rFonts w:ascii="Times New Roman" w:hAnsi="Times New Roman" w:eastAsia="Times New Roman"/>
+                <w:b w:val="0"/>
+                <w:i w:val="0"/>
+                <w:color w:val="1A1C1A"/>
+                <w:sz w:val="18"/>
+              </w:rPr>
+              <w:t>Dosing and soil increment</w:t>
+            </w:r>
+          </w:p>
+        </w:tc>
+        <w:tc>
+          <w:tcPr>
+            <w:tcW w:type="dxa" w:w="3953"/>
+            <w:shd w:val="clear" w:fill="EEF2EF"/>
+          </w:tcPr>
+          <w:p>
+            <w:pPr>
+              <w:spacing w:before="20" w:after="20"/>
+              <w:jc w:val="left"/>
+            </w:pPr>
+            <w:r>
+              <w:rPr>
+                <w:rFonts w:ascii="Times New Roman" w:hAnsi="Times New Roman" w:eastAsia="Times New Roman"/>
+                <w:b w:val="0"/>
+                <w:i w:val="0"/>
+                <w:color w:val="1A1C1A"/>
+                <w:sz w:val="18"/>
+              </w:rPr>
+              <w:t>RS485 seven-parameter NPK probe with MAX485 transceiver, 150 N linear actuator with limit switches, peristaltic pump, needle head with tubing, 500 ml tank with float sensor, relay driver</w:t>
+            </w:r>
+          </w:p>
+        </w:tc>
+        <w:tc>
+          <w:tcPr>
+            <w:tcW w:type="dxa" w:w="2635"/>
+            <w:shd w:val="clear" w:fill="EEF2EF"/>
+          </w:tcPr>
+          <w:p>
+            <w:pPr>
+              <w:spacing w:before="20" w:after="20"/>
+              <w:jc w:val="left"/>
+            </w:pPr>
+            <w:r>
+              <w:rPr>
+                <w:rFonts w:ascii="Times New Roman" w:hAnsi="Times New Roman" w:eastAsia="Times New Roman"/>
+                <w:b w:val="0"/>
+                <w:i w:val="0"/>
+                <w:color w:val="1A1C1A"/>
+                <w:sz w:val="18"/>
+              </w:rPr>
+              <w:t>5,850</w:t>
+            </w:r>
+          </w:p>
+        </w:tc>
+      </w:tr>
+      <w:tr>
+        <w:tc>
+          <w:tcPr>
+            <w:tcW w:type="dxa" w:w="2823"/>
+          </w:tcPr>
+          <w:p>
+            <w:pPr>
+              <w:spacing w:before="20" w:after="20"/>
+              <w:jc w:val="left"/>
+            </w:pPr>
+            <w:r>
+              <w:rPr>
+                <w:rFonts w:ascii="Times New Roman" w:hAnsi="Times New Roman" w:eastAsia="Times New Roman"/>
+                <w:b w:val="0"/>
+                <w:i w:val="0"/>
+                <w:color w:val="1A1C1A"/>
+                <w:sz w:val="18"/>
+              </w:rPr>
+              <w:t>Dosing configuration total</w:t>
+            </w:r>
+          </w:p>
+        </w:tc>
+        <w:tc>
+          <w:tcPr>
+            <w:tcW w:type="dxa" w:w="3953"/>
+          </w:tcPr>
+          <w:p>
+            <w:pPr>
+              <w:spacing w:before="20" w:after="20"/>
+              <w:jc w:val="left"/>
+            </w:pPr>
+            <w:r>
+              <w:rPr>
+                <w:rFonts w:ascii="Times New Roman" w:hAnsi="Times New Roman" w:eastAsia="Times New Roman"/>
+                <w:b w:val="0"/>
+                <w:i w:val="0"/>
+                <w:color w:val="1A1C1A"/>
+                <w:sz w:val="18"/>
+              </w:rPr>
+            </w:r>
+          </w:p>
+        </w:tc>
+        <w:tc>
+          <w:tcPr>
+            <w:tcW w:type="dxa" w:w="2635"/>
+          </w:tcPr>
+          <w:p>
+            <w:pPr>
+              <w:spacing w:before="20" w:after="20"/>
+              <w:jc w:val="left"/>
+            </w:pPr>
+            <w:r>
+              <w:rPr>
+                <w:rFonts w:ascii="Times New Roman" w:hAnsi="Times New Roman" w:eastAsia="Times New Roman"/>
+                <w:b w:val="0"/>
+                <w:i w:val="0"/>
+                <w:color w:val="1A1C1A"/>
+                <w:sz w:val="18"/>
+              </w:rPr>
+              <w:t>47,000</w:t>
             </w:r>
           </w:p>
         </w:tc>
@@ -5793,7 +6024,24 @@
           <w:color w:val="1A1C1A"/>
           <w:sz w:val="22"/>
         </w:rPr>
-        <w:t>The cost structure has a property worth naming: the safety-critical elements are among the cheapest. The latching emergency stop, the relays, and the voltage divider that detects a low pack together account for a small fraction of the total. There is no version of this machine in which safety was traded against cost, because at this scale safety is not what costs money.</w:t>
+        <w:t>Two features of this structure are worth naming. First, compute and power together account for Rs 23,750, or well over half the scout configuration, while the parts that move the machine account for Rs 2,000. The cost of this design is the cost of deciding and the cost of running, not the cost of driving; a cheaper machine is obtained by weakening perception, which is precisely the capability the design exists to provide.</w:t>
+      </w:r>
+    </w:p>
+    <w:p>
+      <w:pPr>
+        <w:keepNext w:val="0"/>
+        <w:spacing w:before="0" w:after="120" w:line="276" w:lineRule="auto"/>
+        <w:jc w:val="both"/>
+      </w:pPr>
+      <w:r>
+        <w:rPr>
+          <w:rFonts w:ascii="Times New Roman" w:hAnsi="Times New Roman" w:eastAsia="Times New Roman"/>
+          <w:b w:val="0"/>
+          <w:i w:val="0"/>
+          <w:color w:val="1A1C1A"/>
+          <w:sz w:val="22"/>
+        </w:rPr>
+        <w:t>Second, the safety-critical elements are among the cheapest. The latching emergency stop with its bumper and ultrasonic backup is costed at Rs 900, and the relays and the voltage divider that detects a low pack are a fraction of that again. There is no version of this machine in which safety was traded against cost, because at this scale safety is not what costs money.</w:t>
       </w:r>
     </w:p>
     <w:p>
@@ -6607,7 +6855,7 @@
           <w:color w:val="1A1C1A"/>
           <w:sz w:val="22"/>
         </w:rPr>
-        <w:t>A fifth limitation is economic rather than technical. A machine at Rs 41,150 in components is not a machine at Rs 41,150 to a farmer, and the path from this bill of materials to an affordable service — shared ownership, custom-hiring, or a data-service model in which the audit trail is the product — is outside the scope of this paper and unvalidated.</w:t>
+        <w:t>A fifth limitation is economic rather than technical. A machine at Rs 47,000 in components is not a machine at Rs 47,000 to a farmer, and the path from this bill of materials to an affordable service — shared ownership, custom-hiring, or a data-service model in which the audit trail is the product — is outside the scope of this paper and unvalidated.</w:t>
       </w:r>
     </w:p>
     <w:p>
@@ -6644,7 +6892,7 @@
           <w:color w:val="1A1C1A"/>
           <w:sz w:val="22"/>
         </w:rPr>
-        <w:t>We have described AgriRover, a differential-drive agricultural robot designed to bring per-plant agrochemical decisions within reach of an Indian smallholding at a component cost of Rs 41,150. The engineering contributions are architectural. Separating hard real-time actuation on a FreeRTOS microcontroller from soft real-time perception on a single-board computer bounds the safety argument to a small, testable tier. Defining the drive-inhibit condition exactly once, as a mask in a single header consumed by every actuating task, makes interlock disagreement unrepresentable rather than merely unlikely. Wiring a latching mechanical stop to the controller enable pin places the final safety guarantee outside software entirely. Authenticating every motion command with a truncated HMAC and a persisted monotonic counter, and inhibiting drive on link loss, ensures that the failure mode of the security layer is a stopped machine.</w:t>
+        <w:t>We have described AgriRover, a differential-drive agricultural robot designed to bring per-plant agrochemical decisions within reach of an Indian smallholding at a component cost under Rs 50,000: Rs 41,150 as a sensing-only scout, approximately Rs 47,000 with the dosing head and soil probe fitted. The engineering contributions are architectural. Separating hard real-time actuation on a FreeRTOS microcontroller from soft real-time perception on a single-board computer bounds the safety argument to a small, testable tier. Defining the drive-inhibit condition exactly once, as a mask in a single header consumed by every actuating task, makes interlock disagreement unrepresentable rather than merely unlikely. Wiring a latching mechanical stop to the controller enable pin places the final safety guarantee outside software entirely. Authenticating every motion command with a truncated HMAC and a persisted monotonic counter, and inhibiting drive on link loss, ensures that the failure mode of the security layer is a stopped machine.</w:t>
       </w:r>
     </w:p>
     <w:p>

</xml_diff>

<commit_message>
feat: enhance technical details and update paper metadata
Co-authored-by: VIVEK KUMAR GUPTA <271483430+aman123825@users.noreply.github.com>
</commit_message>
<xml_diff>
--- a/paper/AgriRover_IEI_38th_National_Convention_Full_Paper.docx
+++ b/paper/AgriRover_IEI_38th_National_Convention_Full_Paper.docx
@@ -5254,7 +5254,7 @@
           <w:color w:val="1A1C1A"/>
           <w:sz w:val="22"/>
         </w:rPr>
-        <w:t>The design is costed in two configurations against a hard ceiling of Rs 50,000. The sensing-only scout configuration — the machine that navigates, images and logs, but carries no chemical — is costed at Rs 41,150. Fitting the needle-injection dosing head and the seven-parameter soil probe described in Sections 5 and 6 adds Rs 5,850, bringing the full machine to approximately Rs 47,000 and leaving roughly Rs 3,000 of the ceiling unallocated against price variance. Both figures are planning totals against Indian retail pricing at the time of specification, exclusive of fabrication labour, taxes, shipping and the spare-parts allowance that a field campaign requires.</w:t>
+        <w:t>The design is costed in two configurations against a hard ceiling of Rs 50,000. The sensing-only scout configuration — the machine that navigates, images and logs, but carries no chemical — is costed at Rs 41,150. Fitting the needle-injection dosing head and the seven-parameter soil probe described in Sections 5 and 6 adds approximately Rs 5,850, bringing the full machine to approximately Rs 47,000. The six scout-configuration rows of Table 5 are point planning prices and sum exactly to Rs 41,150; the dosing increment is different in kind, and we flag it as such. Its components are quoted only as supplier ranges, the probe alone spanning Rs 2,000 to Rs 5,000, so the honest increment is Rs 3,600 to Rs 8,300 and Rs 5,850 is its midpoint. The upper bound of that range would place the machine near Rs 49,500, still under the ceiling but with the contingency exhausted. The residual headroom under the ceiling is in any case committed, not free: the costing sheet earmarks it for replacement motors and connectors, spare storage and camera contingency, which a field campaign consumes. Both figures are planning totals against Indian retail pricing at the time of specification, exclusive of fabrication labour, taxes and shipping. A durability upgrade for sustained field exposure is a further Rs 4,000 to Rs 7,000 above these figures and is not included.</w:t>
       </w:r>
     </w:p>
     <w:p>
@@ -5924,7 +5924,7 @@
                 <w:color w:val="1A1C1A"/>
                 <w:sz w:val="18"/>
               </w:rPr>
-              <w:t>5,850</w:t>
+              <w:t>3,600-8,300 (mid 5,850)</w:t>
             </w:r>
           </w:p>
         </w:tc>
@@ -5988,7 +5988,7 @@
                 <w:color w:val="1A1C1A"/>
                 <w:sz w:val="18"/>
               </w:rPr>
-              <w:t>47,000</w:t>
+              <w:t>approx. 47,000</w:t>
             </w:r>
           </w:p>
         </w:tc>

</xml_diff>

<commit_message>
fix: update paper metadata and content
Co-authored-by: VIVEK KUMAR GUPTA <271483430+aman123825@users.noreply.github.com>
</commit_message>
<xml_diff>
--- a/paper/AgriRover_IEI_38th_National_Convention_Full_Paper.docx
+++ b/paper/AgriRover_IEI_38th_National_Convention_Full_Paper.docx
@@ -1616,7 +1616,7 @@
           <w:color w:val="1A1C1A"/>
           <w:sz w:val="24"/>
         </w:rPr>
-        <w:t>Injection rather than spraying is the more consequential choice. It eliminates the drift cloud that is the principal operator-exposure pathway [3] and the principal off-target loss pathway. It also imposes a hard constraint on the rest of the machine, and it is the constraint that shapes the safety design: the vehicle must be stationary, and provably stationary, for the entire two-and-a-half-second dosing sequence with a needle below the soil surface. Section 6 describes how that is enforced.</w:t>
+        <w:t>Injection rather than spraying is the more consequential choice. It eliminates the drift cloud that is the principal operator-exposure pathway [3] and the principal off-target loss pathway. It also imposes a hard constraint on the rest of the machine, and it is the constraint that shapes the safety design: the vehicle must be stationary, and provably stationary, for the entire dosing sequence — approximately twelve seconds from pre-soak through worst-case actuator retraction, including the 2.3 s dwell-and-inject phase with the needle at full insertion below the soil surface. Section 6 describes how that is enforced.</w:t>
       </w:r>
     </w:p>
     <w:p>
@@ -1684,7 +1684,7 @@
           <w:color w:val="1A1C1A"/>
           <w:sz w:val="24"/>
         </w:rPr>
-        <w:t>The platform runs from a three-cell lithium-polymer pack, 12.6 V full and 11.1 V nominal, monitored through a 39 kΩ / 10 kΩ divider into the ESP32 analogue-to-digital converter with sixteen-fold oversampling and eFuse-calibrated reference. Crossing 9.9 V asserts a low-battery event that both inhibits drive and initiates return-to-base, so that the machine does not strand itself with a needle deployed. Die temperature is monitored with hysteresis, asserting an over-temperature event at 85 °C and clearing it only below 80 °C, which prevents the oscillation that a single-threshold design would produce at the margin.</w:t>
+        <w:t>The platform runs from a four-cell lithium iron phosphate pack, 14.6 V full and 12.8 V nominal, a chemistry chosen over lithium-polymer for its thermal tolerance under sustained hot-climate exposure. Pack voltage is monitored through a 39 kΩ / 10 kΩ divider into the ESP32 analogue-to-digital converter with sixteen-fold oversampling and eFuse-calibrated reference. Crossing 11.0 V, corresponding to 2.75 V per cell, asserts a low-battery event that both inhibits drive and initiates return-to-base, so that the machine does not strand itself with a needle deployed. Die temperature is monitored with hysteresis, asserting an over-temperature event at 85 °C and clearing it only below 80 °C, which prevents the oscillation that a single-threshold design would produce at the margin.</w:t>
       </w:r>
     </w:p>
     <w:p>
@@ -1988,7 +1988,7 @@
                 <w:color w:val="1A1C1A"/>
                 <w:sz w:val="18"/>
               </w:rPr>
-              <w:t>Pack voltage below the 9.9 V cutoff; also triggers return-to-base</w:t>
+              <w:t>Pack voltage below the 11.0 V cutoff; also triggers return-to-base</w:t>
             </w:r>
           </w:p>
         </w:tc>

</xml_diff>